<commit_message>
Add owner registration and multi-company support
</commit_message>
<xml_diff>
--- a/Описание проекта подробно, используемое в разработке.docx
+++ b/Описание проекта подробно, используемое в разработке.docx
@@ -67,26 +67,155 @@
           <w:b/>
           <w:bCs/>
         </w:rPr>
-        <w:t xml:space="preserve">Issuer (завхоз) — выдаёт/принимает инструменты, ведёт реестр, синхронизирует оффлайн-журнал.</w:t>
-      </w:r>
-    </w:p>
-    <w:p>
-      <w:pPr>
-        <w:numPr>
-          <w:ilvl w:val="0"/>
-          <w:numId w:val="6"/>
-        </w:numPr>
-        <w:rPr>
-          <w:b/>
-          <w:bCs/>
-        </w:rPr>
-      </w:pPr>
-      <w:r>
-        <w:rPr>
-          <w:b/>
-          <w:bCs/>
-        </w:rPr>
-        <w:t xml:space="preserve">Owner (владелец) — подтверждает регистрации, управляет пользователями, вправе списывать инструменты.</w:t>
+        <w:t xml:space="preserve">Issuer (завхоз) — выдаёт/принимает инструменты, ведёт реестр инструментов своей компании, синхронизирует оффлайн-журнал.</w:t>
+      </w:r>
+    </w:p>
+    <w:p>
+      <w:pPr>
+        <w:numPr>
+          <w:ilvl w:val="0"/>
+          <w:numId w:val="6"/>
+        </w:numPr>
+        <w:rPr>
+          <w:b/>
+          <w:bCs/>
+        </w:rPr>
+      </w:pPr>
+      <w:r>
+        <w:rPr>
+          <w:b/>
+          <w:bCs/>
+        </w:rPr>
+        <w:t xml:space="preserve">Owner (владелец) — регистрируется сам и создаёт свою компанию, подтверждает регистрации пользователей своей компании, управляет ими, вправе списывать инструменты.</w:t>
+      </w:r>
+    </w:p>
+    <w:p>
+      <w:pPr>
+        <w:rPr>
+          <w:b/>
+          <w:bCs/>
+        </w:rPr>
+      </w:pPr>
+      <w:r>
+        <w:rPr>
+          <w:b/>
+          <w:bCs/>
+        </w:rPr>
+        <w:t xml:space="preserve">Компании</w:t>
+      </w:r>
+    </w:p>
+    <w:p>
+      <w:pPr>
+        <w:numPr>
+          <w:ilvl w:val="0"/>
+          <w:numId w:val="6"/>
+        </w:numPr>
+        <w:rPr>
+          <w:b/>
+          <w:bCs/>
+        </w:rPr>
+      </w:pPr>
+      <w:r>
+        <w:rPr>
+          <w:b/>
+          <w:bCs/>
+        </w:rPr>
+        <w:t xml:space="preserve">Компания — организация, в которой работают пользователи. У компании только название (не длиннее 100 символов, не уникальное): таблица companies содержит id (UUID) и name, других полей нет.</w:t>
+      </w:r>
+    </w:p>
+    <w:p>
+      <w:pPr>
+        <w:numPr>
+          <w:ilvl w:val="0"/>
+          <w:numId w:val="6"/>
+        </w:numPr>
+        <w:rPr>
+          <w:b/>
+          <w:bCs/>
+        </w:rPr>
+      </w:pPr>
+      <w:r>
+        <w:rPr>
+          <w:b/>
+          <w:bCs/>
+        </w:rPr>
+        <w:t xml:space="preserve">Каждый пользователь (любой роли), инструмент и запись журнала принадлежит ровно одной компании; компания не меняется. id компании пользователя лежит в JWT (claim company_id).</w:t>
+      </w:r>
+    </w:p>
+    <w:p>
+      <w:pPr>
+        <w:numPr>
+          <w:ilvl w:val="0"/>
+          <w:numId w:val="6"/>
+        </w:numPr>
+        <w:rPr>
+          <w:b/>
+          <w:bCs/>
+        </w:rPr>
+      </w:pPr>
+      <w:r>
+        <w:rPr>
+          <w:b/>
+          <w:bCs/>
+        </w:rPr>
+        <w:t xml:space="preserve">Компании полностью изолированы. Owner подтверждает и увольняет только пользователей своей компании; Issuer и Owner видят только инструменты и журнал своей компании. Объект другой компании неотличим от несуществующего: ответ 404, а в /api/sync сотрудник и инструмент другой компании получают флаги UNKNOWN_WORKER и UNKNOWN_TOOL. Журнал у каждой компании свой (rental_logs.company_id — компания завхоза, синхронизировавшего запись), и в него не попадают ни сотрудник, ни инструмент, ни завхоз другой компании: это проверяет сервер, а в БД гарантируют составные внешние ключи (issuer_id, company_id), (worker_id, company_id) и (tool_id, company_id).</w:t>
+      </w:r>
+    </w:p>
+    <w:p>
+      <w:pPr>
+        <w:numPr>
+          <w:ilvl w:val="0"/>
+          <w:numId w:val="6"/>
+        </w:numPr>
+        <w:rPr>
+          <w:b/>
+          <w:bCs/>
+        </w:rPr>
+      </w:pPr>
+      <w:r>
+        <w:rPr>
+          <w:b/>
+          <w:bCs/>
+        </w:rPr>
+        <w:t xml:space="preserve">Идентификаторы пользователей, компаний и инструментов — UUID, а не последовательные числа: их нельзя перебрать и по ним нельзя оценить число пользователей или инструментов. Защитой доступа UUID не являются (от чужих данных защищает проверка компании в каждом запросе, а не секретность id). В QR UUID записывается каноническим текстом из 36 символов (строчные hex, 8-4-4-4-12), поэтому QR становится длиннее примерно на 90 символов. id записей журнала — обычные числа: ни один эндпоинт не принимает их на вход, записи всегда выбираются по компании, а порядок сохранения даёт сам id.</w:t>
+      </w:r>
+    </w:p>
+    <w:p>
+      <w:pPr>
+        <w:numPr>
+          <w:ilvl w:val="0"/>
+          <w:numId w:val="6"/>
+        </w:numPr>
+        <w:rPr>
+          <w:b/>
+          <w:bCs/>
+        </w:rPr>
+      </w:pPr>
+      <w:r>
+        <w:rPr>
+          <w:b/>
+          <w:bCs/>
+        </w:rPr>
+        <w:t xml:space="preserve">Компания создаётся при регистрации Owner (POST /api/auth/register с companyName). Отдельного создания, переименования и удаления компаний нет. Списка компаний нет, чтобы нельзя было узнать, кто пользуется системой: Owner берёт id своей компании в GET /api/companies/my (любая роль, только своя компания) и сообщает его сотрудникам и завхозам, а они указывают его при регистрации. Название компании для поиска не используется и не уникально.</w:t>
+      </w:r>
+    </w:p>
+    <w:p>
+      <w:pPr>
+        <w:numPr>
+          <w:ilvl w:val="0"/>
+          <w:numId w:val="6"/>
+        </w:numPr>
+        <w:rPr>
+          <w:b/>
+          <w:bCs/>
+        </w:rPr>
+      </w:pPr>
+      <w:r>
+        <w:rPr>
+          <w:b/>
+          <w:bCs/>
+        </w:rPr>
+        <w:t xml:space="preserve">Открытый вопрос: сколько владельцев может быть у одной компании и можно ли присоединиться к существующей компании как владелец — пока не решено. Схема БД количество Owner в компании не ограничивает (users.company_id не уникален); сейчас регистрация Owner всегда создаёт новую компанию. Если решат «один владелец на компанию» — достаточно уникального индекса по company_id для role = 'Owner'; если несколько — разрешить Owner передавать companyId при регистрации, а заявку подтверждает Owner этой компании.</w:t>
       </w:r>
     </w:p>
     <w:p>
@@ -120,7 +249,7 @@
           <w:b/>
           <w:bCs/>
         </w:rPr>
-        <w:t xml:space="preserve">Пользователь регистрируется (POST /api/auth/register: ФИО, телефон, пароль, роль). ФИО — не длиннее 100 символов: оно попадает в QR сотрудника. Аккаунт создаётся с is_approved = false и is_active = true — доступа к системе нет. Телефон — российский номер: на входе допускаются префиксы +7, 7 или 8 и ровно 10 цифр, между ними пробелы, скобки и дефисы («+7 (999) 123-45-67», «89991234567»); другой формат — 400. Сервер приводит номер к виду +7XXXXXXXXXX и дальше работает только с ним: хранит, проверяет уникальность, ищет при входе, отдаёт в API. Телефон уникален среди всех пользователей, включая уволенных: повторная регистрация на тот же номер (в любой записи) отклоняется (409).</w:t>
+        <w:t xml:space="preserve">Пользователь любой роли (Worker, Issuer, Owner) регистрируется сам (POST /api/auth/register: ФИО, телефон, пароль, роль и компания — см. следующий пункт). ФИО — не длиннее 100 символов: оно попадает в QR сотрудника. Аккаунт Worker и Issuer создаётся с is_approved = false и is_active = true — доступа к системе нет, пока заявку не подтвердит Owner их компании (Owner подтверждается сразу, см. «Владелец и компания» ниже). Телефон — российский номер: на входе допускаются префиксы +7, 7 или 8 и ровно 10 цифр, между ними пробелы, скобки и дефисы («+7 (999) 123-45-67», «89991234567»); другой формат — 400. Сервер приводит номер к виду +7XXXXXXXXXX и дальше работает только с ним: хранит, проверяет уникальность, ищет при входе, отдаёт в API. Телефон уникален среди всех пользователей, включая уволенных: повторная регистрация на тот же номер (в любой записи) отклоняется (409).</w:t>
       </w:r>
     </w:p>
     <w:p>
@@ -139,7 +268,7 @@
           <w:b/>
           <w:bCs/>
         </w:rPr>
-        <w:t xml:space="preserve">Owner подтверждает заявку (POST /api/users/{id}/approve) → is_approved = true. Повторное подтверждение ничего не меняет (200), несуществующий id — 404.</w:t>
+        <w:t xml:space="preserve">Компания при регистрации задаётся по роли. Owner передаёт companyName — вместе с его аккаунтом в одной транзакции создаётся новая компания. Worker и Issuer передают companyId — id существующей компании, который сообщил её Owner; компании с таким id нет — 400. Поля компании не по роли (у Owner нет companyName или есть companyId; у Worker и Issuer нет companyId или есть companyName) — 400. Если телефон уже занят (409), компания не создаётся.</w:t>
       </w:r>
     </w:p>
     <w:p>
@@ -158,7 +287,7 @@
           <w:b/>
           <w:bCs/>
         </w:rPr>
-        <w:t xml:space="preserve">Пользователь входит по телефону (нормализуется так же, как при регистрации) и паролю (POST /api/auth/login) и получает JWT (accessToken) сроком действия 12 часов. JWT подписывается HMAC-SHA256 секретом JWT_SIGNING_KEY и содержит id пользователя (claim sub) и роль (claim role). Вход разрешён только при is_approved = true и is_active = true (иначе 403); неверный телефон или пароль — 401.</w:t>
+        <w:t xml:space="preserve">Owner подтверждает заявку пользователя своей компании (POST /api/users/{id}/approve) → is_approved = true. Повторное подтверждение ничего не меняет (200), несуществующий id и пользователь другой компании — 404.</w:t>
       </w:r>
     </w:p>
     <w:p>
@@ -177,7 +306,26 @@
           <w:b/>
           <w:bCs/>
         </w:rPr>
-        <w:t xml:space="preserve">Первый Owner. Подтвердить Owner может только другой Owner, поэтому первый Owner создаётся сервером при старте из переменных окружения OWNER_PHONE (нормализуется), OWNER_PASSWORD, OWNER_FULLNAME (не длиннее 100 символов) — сразу с is_approved = true — если в базе ещё нет ни одного Owner.</w:t>
+        <w:t xml:space="preserve">Пользователь входит по телефону (нормализуется так же, как при регистрации) и паролю (POST /api/auth/login) и получает JWT (accessToken) сроком действия 12 часов. JWT подписывается HMAC-SHA256 секретом JWT_SIGNING_KEY и содержит id пользователя (claim sub), роль (claim role) и id его компании (claim company_id). Вход разрешён только при is_approved = true и is_active = true (иначе 403); неверный телефон или пароль — 401.</w:t>
+      </w:r>
+    </w:p>
+    <w:p>
+      <w:pPr>
+        <w:numPr>
+          <w:ilvl w:val="0"/>
+          <w:numId w:val="7"/>
+        </w:numPr>
+        <w:rPr>
+          <w:b/>
+          <w:bCs/>
+        </w:rPr>
+      </w:pPr>
+      <w:r>
+        <w:rPr>
+          <w:b/>
+          <w:bCs/>
+        </w:rPr>
+        <w:t xml:space="preserve">Владелец и компания. Owner регистрируется сам, как и остальные роли, и при этом создаёт компанию. Подтвердить Owner некому, поэтому Owner, создающий компанию, получает is_approved = true сразу; регистрация Worker и Issuer по-прежнему требует подтверждения. Заранее заданного владельца в переменных окружения нет.</w:t>
       </w:r>
     </w:p>
     <w:p>
@@ -211,26 +359,26 @@
           <w:b/>
           <w:bCs/>
         </w:rPr>
-        <w:t xml:space="preserve">Owner увольняет пользователя (DELETE /api/users/{id}) → is_active = false. Запись не удаляется: на неё ссылается журнал. Повторный вызов ничего не меняет (200).</w:t>
-      </w:r>
-    </w:p>
-    <w:p>
-      <w:pPr>
-        <w:numPr>
-          <w:ilvl w:val="0"/>
-          <w:numId w:val="6"/>
-        </w:numPr>
-        <w:rPr>
-          <w:b/>
-          <w:bCs/>
-        </w:rPr>
-      </w:pPr>
-      <w:r>
-        <w:rPr>
-          <w:b/>
-          <w:bCs/>
-        </w:rPr>
-        <w:t xml:space="preserve">Owner не может уволить сам себя (409) — иначе система может остаться без владельца.</w:t>
+        <w:t xml:space="preserve">Owner увольняет пользователя своей компании (DELETE /api/users/{id}) → is_active = false. Запись не удаляется: на неё ссылается журнал. Повторный вызов ничего не меняет (200). Пользователь другой компании — 404.</w:t>
+      </w:r>
+    </w:p>
+    <w:p>
+      <w:pPr>
+        <w:numPr>
+          <w:ilvl w:val="0"/>
+          <w:numId w:val="6"/>
+        </w:numPr>
+        <w:rPr>
+          <w:b/>
+          <w:bCs/>
+        </w:rPr>
+      </w:pPr>
+      <w:r>
+        <w:rPr>
+          <w:b/>
+          <w:bCs/>
+        </w:rPr>
+        <w:t xml:space="preserve">Owner не может уволить сам себя (409) — иначе компания может остаться без владельца.</w:t>
       </w:r>
     </w:p>
     <w:p>
@@ -465,7 +613,7 @@
           <w:b/>
           <w:bCs/>
         </w:rPr>
-        <w:t xml:space="preserve">Завхоз заполняет реестр инструментов (POST /api/tools — название, не длиннее 100 символов: оно попадает в QR сотрудника). id присваивает база данных; ответ содержит созданный инструмент с этим id. По id завхоз генерирует и печатает QR-код для наклейки на инструмент. QR инструмента содержит toolId и название инструмента (формат задаёт фронтенд, сервер его не читает).</w:t>
+        <w:t xml:space="preserve">Завхоз заполняет реестр инструментов своей компании (POST /api/tools — название, не длиннее 100 символов: оно попадает в QR сотрудника). id присваивает база данных; ответ содержит созданный инструмент с этим id. По id завхоз генерирует и печатает QR-код для наклейки на инструмент. QR инструмента содержит toolId и название инструмента (формат задаёт фронтенд, сервер его не читает).</w:t>
       </w:r>
     </w:p>
     <w:p>
@@ -484,7 +632,7 @@
           <w:b/>
           <w:bCs/>
         </w:rPr>
-        <w:t xml:space="preserve">Завхоз загружает реестр (GET /api/tools) в локальный реестр. Дальнейшая работа идёт полностью оффлайн.</w:t>
+        <w:t xml:space="preserve">Завхоз загружает реестр своей компании (GET /api/tools) в локальный реестр. Дальнейшая работа идёт полностью оффлайн.</w:t>
       </w:r>
     </w:p>
     <w:p>
@@ -704,7 +852,7 @@
           <w:b/>
           <w:bCs/>
         </w:rPr>
-        <w:t xml:space="preserve">token = base64url(UTF-8 JSON ServerSignedToken) с полями workerId (целое), fio (строка), issuedAt (int64), expiresAt (int64), workerPublicKey (строка base64url).</w:t>
+        <w:t xml:space="preserve">token = base64url(UTF-8 JSON ServerSignedToken) с полями workerId (строка с UUID), fio (строка), issuedAt (int64), expiresAt (int64), workerPublicKey (строка base64url).</w:t>
       </w:r>
     </w:p>
     <w:p>
@@ -742,7 +890,7 @@
           <w:b/>
           <w:bCs/>
         </w:rPr>
-        <w:t xml:space="preserve">op = base64url(UTF-8 JSON RentalOperation) с полями action ("TAKE" | "GIVE"), toolCondition ("Good" | "Damaged" | "Broken"), toolId (целое), toolName (строка), timestamp (int64).</w:t>
+        <w:t xml:space="preserve">op = base64url(UTF-8 JSON RentalOperation) с полями action ("TAKE" | "GIVE"), toolCondition ("Good" | "Damaged" | "Broken"), toolId (строка с UUID), toolName (строка), timestamp (int64).</w:t>
       </w:r>
     </w:p>
     <w:p>
@@ -894,7 +1042,7 @@
           <w:b/>
           <w:bCs/>
         </w:rPr>
-        <w:t xml:space="preserve">строка равна null или не является JSON-строкой; целое записано строкой или с дробной частью; workerId или toolId не больше 0;</w:t>
+        <w:t xml:space="preserve">строка равна null или не является JSON-строкой; целое записано строкой или с дробной частью; workerId или toolId не UUID в каноническом виде (ровно 36 символов, строчные hex, 8-4-4-4-12);</w:t>
       </w:r>
     </w:p>
     <w:p>
@@ -1204,7 +1352,7 @@
           <w:b/>
           <w:bCs/>
         </w:rPr>
-        <w:t xml:space="preserve">Когда появляется интернет, завхоз отправляет накопленные записи массивом [{ qr, scannedAt }]. issuer_id записи берётся из JWT того, кто вызвал /api/sync (текущий авторизованный завхоз), а не из данных QR.</w:t>
+        <w:t xml:space="preserve">Когда появляется интернет, завхоз отправляет накопленные записи массивом [{ qr, scannedAt }]. issuer_id записи берётся из JWT того, кто вызвал /api/sync (текущий авторизованный завхоз), а не из данных QR. Компания записи — компания этого завхоза (company_id из JWT).</w:t>
       </w:r>
     </w:p>
     <w:p>
@@ -1674,6 +1822,77 @@
                 <w:b/>
                 <w:bCs/>
               </w:rPr>
+              <w:t xml:space="preserve">UNKNOWN_WORKER</w:t>
+            </w:r>
+          </w:p>
+        </w:tc>
+        <w:tc>
+          <w:tcPr>
+            <w:tcW w:w="0" w:type="auto"/>
+            <w:vAlign w:val="center"/>
+            <w:hideMark/>
+          </w:tcPr>
+          <w:p>
+            <w:pPr>
+              <w:rPr>
+                <w:b/>
+                <w:bCs/>
+              </w:rPr>
+            </w:pPr>
+            <w:r>
+              <w:rPr>
+                <w:b/>
+                <w:bCs/>
+              </w:rPr>
+              <w:t xml:space="preserve">workerId из token нет среди пользователей компании завхоза (сотрудник другой компании — тоже UNKNOWN_WORKER)</w:t>
+            </w:r>
+          </w:p>
+        </w:tc>
+        <w:tc>
+          <w:tcPr>
+            <w:tcW w:w="0" w:type="auto"/>
+            <w:vAlign w:val="center"/>
+            <w:hideMark/>
+          </w:tcPr>
+          <w:p>
+            <w:pPr>
+              <w:rPr>
+                <w:b/>
+                <w:bCs/>
+              </w:rPr>
+            </w:pPr>
+            <w:r>
+              <w:rPr>
+                <w:b/>
+                <w:bCs/>
+              </w:rPr>
+              <w:t xml:space="preserve">сервер</w:t>
+            </w:r>
+          </w:p>
+        </w:tc>
+      </w:tr>
+      <w:tr>
+        <w:trPr>
+          <w:tblCellSpacing w:w="15" w:type="dxa"/>
+        </w:trPr>
+        <w:tc>
+          <w:tcPr>
+            <w:tcW w:w="0" w:type="auto"/>
+            <w:vAlign w:val="center"/>
+            <w:hideMark/>
+          </w:tcPr>
+          <w:p>
+            <w:pPr>
+              <w:rPr>
+                <w:b/>
+                <w:bCs/>
+              </w:rPr>
+            </w:pPr>
+            <w:r>
+              <w:rPr>
+                <w:b/>
+                <w:bCs/>
+              </w:rPr>
               <w:t xml:space="preserve">UNKNOWN_TOOL</w:t>
             </w:r>
           </w:p>
@@ -1696,7 +1915,7 @@
                 <w:b/>
                 <w:bCs/>
               </w:rPr>
-              <w:t xml:space="preserve">toolId отсутствует в реестре tools</w:t>
+              <w:t xml:space="preserve">toolId из op отсутствует в реестре компании завхоза (инструмент другой компании — тоже UNKNOWN_TOOL)</w:t>
             </w:r>
           </w:p>
         </w:tc>
@@ -2187,7 +2406,7 @@
                 <w:b/>
                 <w:bCs/>
               </w:rPr>
-              <w:t xml:space="preserve">workerId из token</w:t>
+              <w:t xml:space="preserve">workerId из token, если сотрудник есть в компании завхоза, иначе NULL</w:t>
             </w:r>
           </w:p>
         </w:tc>
@@ -2236,7 +2455,149 @@
                 <w:b/>
                 <w:bCs/>
               </w:rPr>
-              <w:t xml:space="preserve">EXPIRED_TOKEN, TIME_DRIFT, DUPLICATE, VALID</w:t>
+              <w:t xml:space="preserve">UNKNOWN_WORKER</w:t>
+            </w:r>
+          </w:p>
+        </w:tc>
+        <w:tc>
+          <w:tcPr>
+            <w:tcW w:w="0" w:type="auto"/>
+            <w:vAlign w:val="center"/>
+            <w:hideMark/>
+          </w:tcPr>
+          <w:p>
+            <w:pPr>
+              <w:rPr>
+                <w:b/>
+                <w:bCs/>
+              </w:rPr>
+            </w:pPr>
+            <w:r>
+              <w:rPr>
+                <w:b/>
+                <w:bCs/>
+              </w:rPr>
+              <w:t xml:space="preserve">NULL</w:t>
+            </w:r>
+          </w:p>
+        </w:tc>
+        <w:tc>
+          <w:tcPr>
+            <w:tcW w:w="0" w:type="auto"/>
+            <w:vAlign w:val="center"/>
+            <w:hideMark/>
+          </w:tcPr>
+          <w:p>
+            <w:pPr>
+              <w:rPr>
+                <w:b/>
+                <w:bCs/>
+              </w:rPr>
+            </w:pPr>
+            <w:r>
+              <w:rPr>
+                <w:b/>
+                <w:bCs/>
+              </w:rPr>
+              <w:t xml:space="preserve">toolId из op, если инструмент есть в реестре компании завхоза, иначе NULL</w:t>
+            </w:r>
+          </w:p>
+        </w:tc>
+      </w:tr>
+      <w:tr>
+        <w:trPr>
+          <w:tblCellSpacing w:w="15" w:type="dxa"/>
+        </w:trPr>
+        <w:tc>
+          <w:tcPr>
+            <w:tcW w:w="0" w:type="auto"/>
+            <w:vAlign w:val="center"/>
+            <w:hideMark/>
+          </w:tcPr>
+          <w:p>
+            <w:pPr>
+              <w:rPr>
+                <w:b/>
+                <w:bCs/>
+              </w:rPr>
+            </w:pPr>
+            <w:r>
+              <w:rPr>
+                <w:b/>
+                <w:bCs/>
+              </w:rPr>
+              <w:t xml:space="preserve">EXPIRED_TOKEN, TIME_DRIFT</w:t>
+            </w:r>
+          </w:p>
+        </w:tc>
+        <w:tc>
+          <w:tcPr>
+            <w:tcW w:w="0" w:type="auto"/>
+            <w:vAlign w:val="center"/>
+            <w:hideMark/>
+          </w:tcPr>
+          <w:p>
+            <w:pPr>
+              <w:rPr>
+                <w:b/>
+                <w:bCs/>
+              </w:rPr>
+            </w:pPr>
+            <w:r>
+              <w:rPr>
+                <w:b/>
+                <w:bCs/>
+              </w:rPr>
+              <w:t xml:space="preserve">workerId из token, если сотрудник есть в компании завхоза, иначе NULL</w:t>
+            </w:r>
+          </w:p>
+        </w:tc>
+        <w:tc>
+          <w:tcPr>
+            <w:tcW w:w="0" w:type="auto"/>
+            <w:vAlign w:val="center"/>
+            <w:hideMark/>
+          </w:tcPr>
+          <w:p>
+            <w:pPr>
+              <w:rPr>
+                <w:b/>
+                <w:bCs/>
+              </w:rPr>
+            </w:pPr>
+            <w:r>
+              <w:rPr>
+                <w:b/>
+                <w:bCs/>
+              </w:rPr>
+              <w:t xml:space="preserve">toolId из op, если инструмент есть в реестре компании завхоза, иначе NULL</w:t>
+            </w:r>
+          </w:p>
+        </w:tc>
+      </w:tr>
+      <w:tr>
+        <w:trPr>
+          <w:tblCellSpacing w:w="15" w:type="dxa"/>
+        </w:trPr>
+        <w:tc>
+          <w:tcPr>
+            <w:tcW w:w="0" w:type="auto"/>
+            <w:vAlign w:val="center"/>
+            <w:hideMark/>
+          </w:tcPr>
+          <w:p>
+            <w:pPr>
+              <w:rPr>
+                <w:b/>
+                <w:bCs/>
+              </w:rPr>
+            </w:pPr>
+            <w:r>
+              <w:rPr>
+                <w:b/>
+                <w:bCs/>
+              </w:rPr>
+              <w:t xml:space="preserve">DUPLICATE, VALID</w:t>
             </w:r>
           </w:p>
         </w:tc>
@@ -2302,7 +2663,7 @@
           <w:b/>
           <w:bCs/>
         </w:rPr>
-        <w:t xml:space="preserve">При невалидной подписи сервера worker_id = NULL: поддельный токен не должен приписывать операцию реальному сотруднику. При невалидной подписи работника tool_id = NULL: неизвестно, что именно заявлял работник. worker_id заполняется, только если такой пользователь есть в users.</w:t>
+        <w:t xml:space="preserve">При невалидной подписи сервера worker_id = NULL: поддельный токен не должен приписывать операцию реальному сотруднику. При невалидной подписи работника tool_id = NULL: неизвестно, что именно заявлял работник. Кроме того, worker_id и tool_id заполняются, только если сотрудник и инструмент есть в компании завхоза (иначе NULL): id другой компании в журнал не попадают, и БД это гарантирует составными внешними ключами. Проверки EXPIRED_TOKEN и TIME_DRIFT выполняются раньше проверок компании, поэтому при них сотрудник и инструмент могут оказаться чужими — тогда соответствующий столбец тоже NULL, а имя берётся из QR.</w:t>
       </w:r>
     </w:p>
     <w:p>
@@ -2412,7 +2773,7 @@
           <w:b/>
           <w:bCs/>
         </w:rPr>
-        <w:t xml:space="preserve">Списание (DELETE /api/tools/{id}, только Owner) → is_active = false, необратимо. Списанный инструмент не попадает в GET /api/tools, но остаётся доступен в GET /api/tools/{id} и в журнале. На проверку записей синхронизации списание не влияет.</w:t>
+        <w:t xml:space="preserve">Списание (DELETE /api/tools/{id}, только Owner, инструмент своей компании) → is_active = false, необратимо. Списанный инструмент не попадает в GET /api/tools, но остаётся доступен в GET /api/tools/{id} и в журнале. На проверку записей синхронизации списание не влияет.</w:t>
       </w:r>
     </w:p>
     <w:p>
@@ -2691,29 +3052,29 @@
                 <w:b/>
                 <w:bCs/>
               </w:rPr>
-              <w:t xml:space="preserve">GET /api/auth/worker-cert</w:t>
-            </w:r>
-          </w:p>
-        </w:tc>
-        <w:tc>
-          <w:tcPr>
-            <w:tcW w:w="0" w:type="auto"/>
-            <w:vAlign w:val="center"/>
-            <w:hideMark/>
-          </w:tcPr>
-          <w:p>
-            <w:pPr>
-              <w:rPr>
-                <w:b/>
-                <w:bCs/>
-              </w:rPr>
-            </w:pPr>
-            <w:r>
-              <w:rPr>
-                <w:b/>
-                <w:bCs/>
-              </w:rPr>
-              <w:t xml:space="preserve">Worker</w:t>
+              <w:t xml:space="preserve">GET /api/companies/my</w:t>
+            </w:r>
+          </w:p>
+        </w:tc>
+        <w:tc>
+          <w:tcPr>
+            <w:tcW w:w="0" w:type="auto"/>
+            <w:vAlign w:val="center"/>
+            <w:hideMark/>
+          </w:tcPr>
+          <w:p>
+            <w:pPr>
+              <w:rPr>
+                <w:b/>
+                <w:bCs/>
+              </w:rPr>
+            </w:pPr>
+            <w:r>
+              <w:rPr>
+                <w:b/>
+                <w:bCs/>
+              </w:rPr>
+              <w:t xml:space="preserve">Worker, Issuer, Owner (любая роль, только своя компания)</w:t>
             </w:r>
           </w:p>
         </w:tc>
@@ -2740,29 +3101,29 @@
                 <w:b/>
                 <w:bCs/>
               </w:rPr>
-              <w:t xml:space="preserve">GET /api/users, DELETE /api/users/{id}, POST /api/users/{id}/approve</w:t>
-            </w:r>
-          </w:p>
-        </w:tc>
-        <w:tc>
-          <w:tcPr>
-            <w:tcW w:w="0" w:type="auto"/>
-            <w:vAlign w:val="center"/>
-            <w:hideMark/>
-          </w:tcPr>
-          <w:p>
-            <w:pPr>
-              <w:rPr>
-                <w:b/>
-                <w:bCs/>
-              </w:rPr>
-            </w:pPr>
-            <w:r>
-              <w:rPr>
-                <w:b/>
-                <w:bCs/>
-              </w:rPr>
-              <w:t xml:space="preserve">Owner</w:t>
+              <w:t xml:space="preserve">GET /api/auth/worker-cert</w:t>
+            </w:r>
+          </w:p>
+        </w:tc>
+        <w:tc>
+          <w:tcPr>
+            <w:tcW w:w="0" w:type="auto"/>
+            <w:vAlign w:val="center"/>
+            <w:hideMark/>
+          </w:tcPr>
+          <w:p>
+            <w:pPr>
+              <w:rPr>
+                <w:b/>
+                <w:bCs/>
+              </w:rPr>
+            </w:pPr>
+            <w:r>
+              <w:rPr>
+                <w:b/>
+                <w:bCs/>
+              </w:rPr>
+              <w:t xml:space="preserve">Worker</w:t>
             </w:r>
           </w:p>
         </w:tc>
@@ -2789,29 +3150,29 @@
                 <w:b/>
                 <w:bCs/>
               </w:rPr>
-              <w:t xml:space="preserve">GET /api/tools, POST /api/tools, GET /api/tools/{id}, PATCH /api/tools/{id}</w:t>
-            </w:r>
-          </w:p>
-        </w:tc>
-        <w:tc>
-          <w:tcPr>
-            <w:tcW w:w="0" w:type="auto"/>
-            <w:vAlign w:val="center"/>
-            <w:hideMark/>
-          </w:tcPr>
-          <w:p>
-            <w:pPr>
-              <w:rPr>
-                <w:b/>
-                <w:bCs/>
-              </w:rPr>
-            </w:pPr>
-            <w:r>
-              <w:rPr>
-                <w:b/>
-                <w:bCs/>
-              </w:rPr>
-              <w:t xml:space="preserve">Issuer, Owner</w:t>
+              <w:t xml:space="preserve">GET /api/users, DELETE /api/users/{id}, POST /api/users/{id}/approve</w:t>
+            </w:r>
+          </w:p>
+        </w:tc>
+        <w:tc>
+          <w:tcPr>
+            <w:tcW w:w="0" w:type="auto"/>
+            <w:vAlign w:val="center"/>
+            <w:hideMark/>
+          </w:tcPr>
+          <w:p>
+            <w:pPr>
+              <w:rPr>
+                <w:b/>
+                <w:bCs/>
+              </w:rPr>
+            </w:pPr>
+            <w:r>
+              <w:rPr>
+                <w:b/>
+                <w:bCs/>
+              </w:rPr>
+              <w:t xml:space="preserve">Owner</w:t>
             </w:r>
           </w:p>
         </w:tc>
@@ -2838,29 +3199,29 @@
                 <w:b/>
                 <w:bCs/>
               </w:rPr>
-              <w:t xml:space="preserve">DELETE /api/tools/{id}</w:t>
-            </w:r>
-          </w:p>
-        </w:tc>
-        <w:tc>
-          <w:tcPr>
-            <w:tcW w:w="0" w:type="auto"/>
-            <w:vAlign w:val="center"/>
-            <w:hideMark/>
-          </w:tcPr>
-          <w:p>
-            <w:pPr>
-              <w:rPr>
-                <w:b/>
-                <w:bCs/>
-              </w:rPr>
-            </w:pPr>
-            <w:r>
-              <w:rPr>
-                <w:b/>
-                <w:bCs/>
-              </w:rPr>
-              <w:t xml:space="preserve">Owner</w:t>
+              <w:t xml:space="preserve">GET /api/tools, POST /api/tools, GET /api/tools/{id}, PATCH /api/tools/{id}</w:t>
+            </w:r>
+          </w:p>
+        </w:tc>
+        <w:tc>
+          <w:tcPr>
+            <w:tcW w:w="0" w:type="auto"/>
+            <w:vAlign w:val="center"/>
+            <w:hideMark/>
+          </w:tcPr>
+          <w:p>
+            <w:pPr>
+              <w:rPr>
+                <w:b/>
+                <w:bCs/>
+              </w:rPr>
+            </w:pPr>
+            <w:r>
+              <w:rPr>
+                <w:b/>
+                <w:bCs/>
+              </w:rPr>
+              <w:t xml:space="preserve">Issuer, Owner</w:t>
             </w:r>
           </w:p>
         </w:tc>
@@ -2887,29 +3248,29 @@
                 <w:b/>
                 <w:bCs/>
               </w:rPr>
-              <w:t xml:space="preserve">POST /api/sync</w:t>
-            </w:r>
-          </w:p>
-        </w:tc>
-        <w:tc>
-          <w:tcPr>
-            <w:tcW w:w="0" w:type="auto"/>
-            <w:vAlign w:val="center"/>
-            <w:hideMark/>
-          </w:tcPr>
-          <w:p>
-            <w:pPr>
-              <w:rPr>
-                <w:b/>
-                <w:bCs/>
-              </w:rPr>
-            </w:pPr>
-            <w:r>
-              <w:rPr>
-                <w:b/>
-                <w:bCs/>
-              </w:rPr>
-              <w:t xml:space="preserve">Issuer</w:t>
+              <w:t xml:space="preserve">DELETE /api/tools/{id}</w:t>
+            </w:r>
+          </w:p>
+        </w:tc>
+        <w:tc>
+          <w:tcPr>
+            <w:tcW w:w="0" w:type="auto"/>
+            <w:vAlign w:val="center"/>
+            <w:hideMark/>
+          </w:tcPr>
+          <w:p>
+            <w:pPr>
+              <w:rPr>
+                <w:b/>
+                <w:bCs/>
+              </w:rPr>
+            </w:pPr>
+            <w:r>
+              <w:rPr>
+                <w:b/>
+                <w:bCs/>
+              </w:rPr>
+              <w:t xml:space="preserve">Owner</w:t>
             </w:r>
           </w:p>
         </w:tc>
@@ -2936,6 +3297,55 @@
                 <w:b/>
                 <w:bCs/>
               </w:rPr>
+              <w:t xml:space="preserve">POST /api/sync</w:t>
+            </w:r>
+          </w:p>
+        </w:tc>
+        <w:tc>
+          <w:tcPr>
+            <w:tcW w:w="0" w:type="auto"/>
+            <w:vAlign w:val="center"/>
+            <w:hideMark/>
+          </w:tcPr>
+          <w:p>
+            <w:pPr>
+              <w:rPr>
+                <w:b/>
+                <w:bCs/>
+              </w:rPr>
+            </w:pPr>
+            <w:r>
+              <w:rPr>
+                <w:b/>
+                <w:bCs/>
+              </w:rPr>
+              <w:t xml:space="preserve">Issuer</w:t>
+            </w:r>
+          </w:p>
+        </w:tc>
+      </w:tr>
+      <w:tr>
+        <w:trPr>
+          <w:tblCellSpacing w:w="15" w:type="dxa"/>
+        </w:trPr>
+        <w:tc>
+          <w:tcPr>
+            <w:tcW w:w="0" w:type="auto"/>
+            <w:vAlign w:val="center"/>
+            <w:hideMark/>
+          </w:tcPr>
+          <w:p>
+            <w:pPr>
+              <w:rPr>
+                <w:b/>
+                <w:bCs/>
+              </w:rPr>
+            </w:pPr>
+            <w:r>
+              <w:rPr>
+                <w:b/>
+                <w:bCs/>
+              </w:rPr>
               <w:t xml:space="preserve">GET /api/logs</w:t>
             </w:r>
           </w:p>
@@ -2966,6 +3376,25 @@
     </w:tbl>
     <w:p>
       <w:pPr>
+        <w:numPr>
+          <w:ilvl w:val="0"/>
+          <w:numId w:val="6"/>
+        </w:numPr>
+        <w:rPr>
+          <w:b/>
+          <w:bCs/>
+        </w:rPr>
+      </w:pPr>
+      <w:r>
+        <w:rPr>
+          <w:b/>
+          <w:bCs/>
+        </w:rPr>
+        <w:t xml:space="preserve">Все эндпоинты, требующие роль, работают только с данными компании вызывающего (company_id из JWT): пользователи и инструменты другой компании недоступны (404), журнал показывает только записи завхозов своей компании.</w:t>
+      </w:r>
+    </w:p>
+    <w:p>
+      <w:pPr>
         <w:rPr>
           <w:b/>
           <w:bCs/>
@@ -3162,7 +3591,45 @@
           <w:b/>
           <w:bCs/>
         </w:rPr>
-        <w:t xml:space="preserve">Нет смены и сброса пароля; пароль первого Owner — значение OWNER_PASSWORD при первом старте.</w:t>
+        <w:t xml:space="preserve">Нет смены и сброса пароля.</w:t>
+      </w:r>
+    </w:p>
+    <w:p>
+      <w:pPr>
+        <w:numPr>
+          <w:ilvl w:val="0"/>
+          <w:numId w:val="6"/>
+        </w:numPr>
+        <w:rPr>
+          <w:b/>
+          <w:bCs/>
+        </w:rPr>
+      </w:pPr>
+      <w:r>
+        <w:rPr>
+          <w:b/>
+          <w:bCs/>
+        </w:rPr>
+        <w:t xml:space="preserve">Нет смены компании у пользователя, переименования и удаления компаний. Уволенный пользователь остаётся в своей компании.</w:t>
+      </w:r>
+    </w:p>
+    <w:p>
+      <w:pPr>
+        <w:numPr>
+          <w:ilvl w:val="0"/>
+          <w:numId w:val="6"/>
+        </w:numPr>
+        <w:rPr>
+          <w:b/>
+          <w:bCs/>
+        </w:rPr>
+      </w:pPr>
+      <w:r>
+        <w:rPr>
+          <w:b/>
+          <w:bCs/>
+        </w:rPr>
+        <w:t xml:space="preserve">Регистрация Owner открыта без авторизации: любой желающий может создать компанию, ограничений на создание нет. Id компании — не секрет для тех, кому его сообщил Owner: зная его, любой может подать заявку на регистрацию (её подтверждает Owner компании).</w:t>
       </w:r>
     </w:p>
     <w:sectPr>

</xml_diff>

<commit_message>
Add rabbitMQ and complete auth services
</commit_message>
<xml_diff>
--- a/Описание проекта подробно, используемое в разработке.docx
+++ b/Описание проекта подробно, используемое в разработке.docx
@@ -306,7 +306,7 @@
           <w:b/>
           <w:bCs/>
         </w:rPr>
-        <w:t xml:space="preserve">Пользователь входит по телефону (нормализуется так же, как при регистрации) и паролю (POST /api/auth/login) и получает JWT (accessToken) сроком действия 12 часов. JWT подписывается HMAC-SHA256 секретом JWT_SIGNING_KEY и содержит id пользователя (claim sub), роль (claim role) и id его компании (claim company_id). Вход разрешён только при is_approved = true и is_active = true (иначе 403); неверный телефон или пароль — 401.</w:t>
+        <w:t xml:space="preserve">Пользователь входит по телефону (нормализуется так же, как при регистрации) и паролю (POST /api/auth/login) и получает сессию — пару токенов. Access token — JWT (accessToken в теле ответа, expiresIn = 900) сроком действия 15 минут; подписывается HMAC-SHA256 секретом JWT_SIGNING_KEY и содержит id пользователя (claim sub), роль (claim role) и id его компании (claim company_id). Refresh token — случайные 32 байта (base64url без паддинга, 43 символа) в cookie refresh_token с атрибутами HttpOnly; Secure; SameSite=Strict; Path=/api/auth, срок действия — 30 дней. JavaScript эту cookie не видит, браузер отправляет её только на /api/auth/*. Сервер хранит не сам refresh token, а его SHA-256 (таблица refresh_tokens). Вход разрешён только при is_approved = true и is_active = true (иначе 403, cookie не выставляется); неверный телефон или пароль — 401. Каждый вход — новая сессия, прежние сессии пользователя на других устройствах не затрагиваются.</w:t>
       </w:r>
     </w:p>
     <w:p>
@@ -325,6 +325,44 @@
           <w:b/>
           <w:bCs/>
         </w:rPr>
+        <w:t xml:space="preserve">Access token истёк (401 от любого эндпоинта) — клиент вызывает POST /api/auth/refresh: без JWT, refresh token берётся из cookie. Ротация: предъявленный refresh token гасится, взамен в той же сессии выдаётся новый со сроком 30 дней и новый access token; роль и компания в новом JWT — текущие, из БД. Если cookie нет, токен неизвестен, истёк или погашен, а также если пользователь уволен — 401 (причины не различаются), cookie удаляется. Повторное предъявление токена, уже погашенного ротацией, — признак кражи: гасится вся сессия, включая выданный взамен токен; сессии на других устройствах не затрагиваются. Поэтому клиент не вызывает refresh параллельно, в том числе из нескольких вкладок.</w:t>
+      </w:r>
+    </w:p>
+    <w:p>
+      <w:pPr>
+        <w:numPr>
+          <w:ilvl w:val="0"/>
+          <w:numId w:val="7"/>
+        </w:numPr>
+        <w:rPr>
+          <w:b/>
+          <w:bCs/>
+        </w:rPr>
+      </w:pPr>
+      <w:r>
+        <w:rPr>
+          <w:b/>
+          <w:bCs/>
+        </w:rPr>
+        <w:t xml:space="preserve">Выход (POST /api/auth/logout, без JWT) гасит refresh token из cookie вместе со всей его сессией и удаляет cookie. Ответ всегда 204 — в том числе без cookie, с неизвестным или уже погашенным токеном. Access token не отзывается: клиент просто забывает его, он истекает сам не позже чем через 15 минут.</w:t>
+      </w:r>
+    </w:p>
+    <w:p>
+      <w:pPr>
+        <w:numPr>
+          <w:ilvl w:val="0"/>
+          <w:numId w:val="7"/>
+        </w:numPr>
+        <w:rPr>
+          <w:b/>
+          <w:bCs/>
+        </w:rPr>
+      </w:pPr>
+      <w:r>
+        <w:rPr>
+          <w:b/>
+          <w:bCs/>
+        </w:rPr>
         <w:t xml:space="preserve">Владелец и компания. Owner регистрируется сам, как и остальные роли, и при этом создаёт компанию. Подтвердить Owner некому, поэтому Owner, создающий компанию, получает is_approved = true сразу; регистрация Worker и Issuer по-прежнему требует подтверждения. Заранее заданного владельца в переменных окружения нет.</w:t>
       </w:r>
     </w:p>
@@ -359,7 +397,7 @@
           <w:b/>
           <w:bCs/>
         </w:rPr>
-        <w:t xml:space="preserve">Owner увольняет пользователя своей компании (DELETE /api/users/{id}) → is_active = false. Запись не удаляется: на неё ссылается журнал. Повторный вызов ничего не меняет (200). Пользователь другой компании — 404.</w:t>
+        <w:t xml:space="preserve">Owner увольняет пользователя своей компании (DELETE /api/users/{id}) → is_active = false, и запоминается момент увольнения (deactivated_at, время сервера). Запись не удаляется: на неё ссылается журнал. В той же транзакции гасятся все refresh token пользователя — все его сессии на всех устройствах: следующий /api/auth/refresh вернёт 401. Повторный вызов ничего не меняет (200), момент увольнения остаётся прежним. Пользователь другой компании — 404.</w:t>
       </w:r>
     </w:p>
     <w:p>
@@ -397,7 +435,7 @@
           <w:b/>
           <w:bCs/>
         </w:rPr>
-        <w:t xml:space="preserve">Отзыва JWT и сертификатов нет (сознательно): уже выданные JWT и сертификат действуют до конца своего срока — не более 12 часов. Уволенный сотрудник может доработать смену, это допустимо. Новые JWT и сертификаты уволенному не выдаются.</w:t>
+        <w:t xml:space="preserve">После увольнения продолжают действовать: выданный access token — до истечения срока, не более 15 минут (JWT не отзывается); офлайн-сертификат сотрудника — до истечения срока, не более 12 часов: он проверяется без сервера, отозвать его нельзя. Поэтому операции с временем не раньше момента увольнения при синхронизации получают флаг WORKER_DEACTIVATED. Новые access token, refresh token и сертификаты уволенному не выдаются.</w:t>
       </w:r>
     </w:p>
     <w:p>
@@ -1893,6 +1931,77 @@
                 <w:b/>
                 <w:bCs/>
               </w:rPr>
+              <w:t xml:space="preserve">WORKER_DEACTIVATED</w:t>
+            </w:r>
+          </w:p>
+        </w:tc>
+        <w:tc>
+          <w:tcPr>
+            <w:tcW w:w="0" w:type="auto"/>
+            <w:vAlign w:val="center"/>
+            <w:hideMark/>
+          </w:tcPr>
+          <w:p>
+            <w:pPr>
+              <w:rPr>
+                <w:b/>
+                <w:bCs/>
+              </w:rPr>
+            </w:pPr>
+            <w:r>
+              <w:rPr>
+                <w:b/>
+                <w:bCs/>
+              </w:rPr>
+              <w:t xml:space="preserve">сотрудник уволен, и timestamp не раньше момента увольнения (deactivated_at): офлайн-сертификат не отзывается, поэтому операции после увольнения отсекаются здесь. Подделать время назад сотрудник не может: scannedAt ставит завхоз, и расхождение даст TIME_DRIFT раньше</w:t>
+            </w:r>
+          </w:p>
+        </w:tc>
+        <w:tc>
+          <w:tcPr>
+            <w:tcW w:w="0" w:type="auto"/>
+            <w:vAlign w:val="center"/>
+            <w:hideMark/>
+          </w:tcPr>
+          <w:p>
+            <w:pPr>
+              <w:rPr>
+                <w:b/>
+                <w:bCs/>
+              </w:rPr>
+            </w:pPr>
+            <w:r>
+              <w:rPr>
+                <w:b/>
+                <w:bCs/>
+              </w:rPr>
+              <w:t xml:space="preserve">сервер</w:t>
+            </w:r>
+          </w:p>
+        </w:tc>
+      </w:tr>
+      <w:tr>
+        <w:trPr>
+          <w:tblCellSpacing w:w="15" w:type="dxa"/>
+        </w:trPr>
+        <w:tc>
+          <w:tcPr>
+            <w:tcW w:w="0" w:type="auto"/>
+            <w:vAlign w:val="center"/>
+            <w:hideMark/>
+          </w:tcPr>
+          <w:p>
+            <w:pPr>
+              <w:rPr>
+                <w:b/>
+                <w:bCs/>
+              </w:rPr>
+            </w:pPr>
+            <w:r>
+              <w:rPr>
+                <w:b/>
+                <w:bCs/>
+              </w:rPr>
               <w:t xml:space="preserve">UNKNOWN_TOOL</w:t>
             </w:r>
           </w:p>
@@ -2526,7 +2635,7 @@
                 <w:b/>
                 <w:bCs/>
               </w:rPr>
-              <w:t xml:space="preserve">EXPIRED_TOKEN, TIME_DRIFT</w:t>
+              <w:t xml:space="preserve">EXPIRED_TOKEN, TIME_DRIFT, WORKER_DEACTIVATED</w:t>
             </w:r>
           </w:p>
         </w:tc>
@@ -2954,7 +3063,7 @@
                 <w:b/>
                 <w:bCs/>
               </w:rPr>
-              <w:t xml:space="preserve">POST /api/auth/register, POST /api/auth/login</w:t>
+              <w:t xml:space="preserve">POST /api/auth/register, POST /api/auth/login, POST /api/auth/refresh, POST /api/auth/logout</w:t>
             </w:r>
           </w:p>
         </w:tc>
@@ -3477,7 +3586,7 @@
           <w:b/>
           <w:bCs/>
         </w:rPr>
-        <w:t xml:space="preserve">Нет отзыва JWT и сертификатов: после увольнения они действуют до истечения срока (не более 12 часов).</w:t>
+        <w:t xml:space="preserve">Нет отзыва access token (JWT) и офлайн-сертификатов: после увольнения JWT действует до истечения срока (не более 15 минут), сертификат — не более 12 часов; операции по сертификату после увольнения помечаются флагом WORKER_DEACTIVATED.</w:t>
       </w:r>
     </w:p>
     <w:p>

</xml_diff>

<commit_message>
Project audit: fix docs drift, Docker/nginx config and test gaps
- Docker: frontend/.dockerignore (no Windows node_modules in context), node:24 + npm ci;
  backend/.dockerignore excludes .vs and TestResults; nginx accepts large /api/sync bodies (30m)
- API fails fast on missing/short JWT_SIGNING_KEY or invalid SERVER_SIGNING_KEY
- Worker dead-letters messages whose handler throws unexpectedly instead of leaving them unacked
- rental.synced is published only when new log records were saved (resend-only sync is a no-op)
- Tests: fix duplicate theory row in QrPayloadParserTests (now covers base64url length % 4 == 1),
  add resend-only sync audit test, bump xunit to 2.9.3 (drops vulnerable transitive packages)
- Docs: architecture diagrams gain refresh/logout/users-me and refresh_tokens; spec docx gains
  events/notifications section and permissions; README, events.md updated
- Remove stray root package.json/package-lock.json; ignore TestResults/
</commit_message>
<xml_diff>
--- a/Описание проекта подробно, используемое в разработке.docx
+++ b/Описание проекта подробно, используемое в разработке.docx
@@ -3210,29 +3210,29 @@
                 <w:b/>
                 <w:bCs/>
               </w:rPr>
-              <w:t xml:space="preserve">GET /api/auth/worker-cert</w:t>
-            </w:r>
-          </w:p>
-        </w:tc>
-        <w:tc>
-          <w:tcPr>
-            <w:tcW w:w="0" w:type="auto"/>
-            <w:vAlign w:val="center"/>
-            <w:hideMark/>
-          </w:tcPr>
-          <w:p>
-            <w:pPr>
-              <w:rPr>
-                <w:b/>
-                <w:bCs/>
-              </w:rPr>
-            </w:pPr>
-            <w:r>
-              <w:rPr>
-                <w:b/>
-                <w:bCs/>
-              </w:rPr>
-              <w:t xml:space="preserve">Worker</w:t>
+              <w:t xml:space="preserve">GET /api/users/me</w:t>
+            </w:r>
+          </w:p>
+        </w:tc>
+        <w:tc>
+          <w:tcPr>
+            <w:tcW w:w="0" w:type="auto"/>
+            <w:vAlign w:val="center"/>
+            <w:hideMark/>
+          </w:tcPr>
+          <w:p>
+            <w:pPr>
+              <w:rPr>
+                <w:b/>
+                <w:bCs/>
+              </w:rPr>
+            </w:pPr>
+            <w:r>
+              <w:rPr>
+                <w:b/>
+                <w:bCs/>
+              </w:rPr>
+              <w:t xml:space="preserve">Worker, Issuer, Owner (любая роль, только свой профиль)</w:t>
             </w:r>
           </w:p>
         </w:tc>
@@ -3259,29 +3259,29 @@
                 <w:b/>
                 <w:bCs/>
               </w:rPr>
-              <w:t xml:space="preserve">GET /api/users, DELETE /api/users/{id}, POST /api/users/{id}/approve</w:t>
-            </w:r>
-          </w:p>
-        </w:tc>
-        <w:tc>
-          <w:tcPr>
-            <w:tcW w:w="0" w:type="auto"/>
-            <w:vAlign w:val="center"/>
-            <w:hideMark/>
-          </w:tcPr>
-          <w:p>
-            <w:pPr>
-              <w:rPr>
-                <w:b/>
-                <w:bCs/>
-              </w:rPr>
-            </w:pPr>
-            <w:r>
-              <w:rPr>
-                <w:b/>
-                <w:bCs/>
-              </w:rPr>
-              <w:t xml:space="preserve">Owner</w:t>
+              <w:t xml:space="preserve">GET /api/auth/worker-cert</w:t>
+            </w:r>
+          </w:p>
+        </w:tc>
+        <w:tc>
+          <w:tcPr>
+            <w:tcW w:w="0" w:type="auto"/>
+            <w:vAlign w:val="center"/>
+            <w:hideMark/>
+          </w:tcPr>
+          <w:p>
+            <w:pPr>
+              <w:rPr>
+                <w:b/>
+                <w:bCs/>
+              </w:rPr>
+            </w:pPr>
+            <w:r>
+              <w:rPr>
+                <w:b/>
+                <w:bCs/>
+              </w:rPr>
+              <w:t xml:space="preserve">Worker</w:t>
             </w:r>
           </w:p>
         </w:tc>
@@ -3308,29 +3308,29 @@
                 <w:b/>
                 <w:bCs/>
               </w:rPr>
-              <w:t xml:space="preserve">GET /api/tools, POST /api/tools, GET /api/tools/{id}, PATCH /api/tools/{id}</w:t>
-            </w:r>
-          </w:p>
-        </w:tc>
-        <w:tc>
-          <w:tcPr>
-            <w:tcW w:w="0" w:type="auto"/>
-            <w:vAlign w:val="center"/>
-            <w:hideMark/>
-          </w:tcPr>
-          <w:p>
-            <w:pPr>
-              <w:rPr>
-                <w:b/>
-                <w:bCs/>
-              </w:rPr>
-            </w:pPr>
-            <w:r>
-              <w:rPr>
-                <w:b/>
-                <w:bCs/>
-              </w:rPr>
-              <w:t xml:space="preserve">Issuer, Owner</w:t>
+              <w:t xml:space="preserve">GET /api/users, DELETE /api/users/{id}, POST /api/users/{id}/approve</w:t>
+            </w:r>
+          </w:p>
+        </w:tc>
+        <w:tc>
+          <w:tcPr>
+            <w:tcW w:w="0" w:type="auto"/>
+            <w:vAlign w:val="center"/>
+            <w:hideMark/>
+          </w:tcPr>
+          <w:p>
+            <w:pPr>
+              <w:rPr>
+                <w:b/>
+                <w:bCs/>
+              </w:rPr>
+            </w:pPr>
+            <w:r>
+              <w:rPr>
+                <w:b/>
+                <w:bCs/>
+              </w:rPr>
+              <w:t xml:space="preserve">Owner</w:t>
             </w:r>
           </w:p>
         </w:tc>
@@ -3357,29 +3357,29 @@
                 <w:b/>
                 <w:bCs/>
               </w:rPr>
-              <w:t xml:space="preserve">DELETE /api/tools/{id}</w:t>
-            </w:r>
-          </w:p>
-        </w:tc>
-        <w:tc>
-          <w:tcPr>
-            <w:tcW w:w="0" w:type="auto"/>
-            <w:vAlign w:val="center"/>
-            <w:hideMark/>
-          </w:tcPr>
-          <w:p>
-            <w:pPr>
-              <w:rPr>
-                <w:b/>
-                <w:bCs/>
-              </w:rPr>
-            </w:pPr>
-            <w:r>
-              <w:rPr>
-                <w:b/>
-                <w:bCs/>
-              </w:rPr>
-              <w:t xml:space="preserve">Owner</w:t>
+              <w:t xml:space="preserve">GET /api/tools, POST /api/tools, GET /api/tools/{id}, PATCH /api/tools/{id}</w:t>
+            </w:r>
+          </w:p>
+        </w:tc>
+        <w:tc>
+          <w:tcPr>
+            <w:tcW w:w="0" w:type="auto"/>
+            <w:vAlign w:val="center"/>
+            <w:hideMark/>
+          </w:tcPr>
+          <w:p>
+            <w:pPr>
+              <w:rPr>
+                <w:b/>
+                <w:bCs/>
+              </w:rPr>
+            </w:pPr>
+            <w:r>
+              <w:rPr>
+                <w:b/>
+                <w:bCs/>
+              </w:rPr>
+              <w:t xml:space="preserve">Issuer, Owner</w:t>
             </w:r>
           </w:p>
         </w:tc>
@@ -3406,29 +3406,29 @@
                 <w:b/>
                 <w:bCs/>
               </w:rPr>
-              <w:t xml:space="preserve">POST /api/sync</w:t>
-            </w:r>
-          </w:p>
-        </w:tc>
-        <w:tc>
-          <w:tcPr>
-            <w:tcW w:w="0" w:type="auto"/>
-            <w:vAlign w:val="center"/>
-            <w:hideMark/>
-          </w:tcPr>
-          <w:p>
-            <w:pPr>
-              <w:rPr>
-                <w:b/>
-                <w:bCs/>
-              </w:rPr>
-            </w:pPr>
-            <w:r>
-              <w:rPr>
-                <w:b/>
-                <w:bCs/>
-              </w:rPr>
-              <w:t xml:space="preserve">Issuer</w:t>
+              <w:t xml:space="preserve">DELETE /api/tools/{id}</w:t>
+            </w:r>
+          </w:p>
+        </w:tc>
+        <w:tc>
+          <w:tcPr>
+            <w:tcW w:w="0" w:type="auto"/>
+            <w:vAlign w:val="center"/>
+            <w:hideMark/>
+          </w:tcPr>
+          <w:p>
+            <w:pPr>
+              <w:rPr>
+                <w:b/>
+                <w:bCs/>
+              </w:rPr>
+            </w:pPr>
+            <w:r>
+              <w:rPr>
+                <w:b/>
+                <w:bCs/>
+              </w:rPr>
+              <w:t xml:space="preserve">Owner</w:t>
             </w:r>
           </w:p>
         </w:tc>
@@ -3455,6 +3455,55 @@
                 <w:b/>
                 <w:bCs/>
               </w:rPr>
+              <w:t xml:space="preserve">POST /api/sync</w:t>
+            </w:r>
+          </w:p>
+        </w:tc>
+        <w:tc>
+          <w:tcPr>
+            <w:tcW w:w="0" w:type="auto"/>
+            <w:vAlign w:val="center"/>
+            <w:hideMark/>
+          </w:tcPr>
+          <w:p>
+            <w:pPr>
+              <w:rPr>
+                <w:b/>
+                <w:bCs/>
+              </w:rPr>
+            </w:pPr>
+            <w:r>
+              <w:rPr>
+                <w:b/>
+                <w:bCs/>
+              </w:rPr>
+              <w:t xml:space="preserve">Issuer</w:t>
+            </w:r>
+          </w:p>
+        </w:tc>
+      </w:tr>
+      <w:tr>
+        <w:trPr>
+          <w:tblCellSpacing w:w="15" w:type="dxa"/>
+        </w:trPr>
+        <w:tc>
+          <w:tcPr>
+            <w:tcW w:w="0" w:type="auto"/>
+            <w:vAlign w:val="center"/>
+            <w:hideMark/>
+          </w:tcPr>
+          <w:p>
+            <w:pPr>
+              <w:rPr>
+                <w:b/>
+                <w:bCs/>
+              </w:rPr>
+            </w:pPr>
+            <w:r>
+              <w:rPr>
+                <w:b/>
+                <w:bCs/>
+              </w:rPr>
               <w:t xml:space="preserve">GET /api/logs</w:t>
             </w:r>
           </w:p>
@@ -3478,6 +3527,55 @@
                 <w:bCs/>
               </w:rPr>
               <w:t xml:space="preserve">Issuer, Owner</w:t>
+            </w:r>
+          </w:p>
+        </w:tc>
+      </w:tr>
+      <w:tr>
+        <w:trPr>
+          <w:tblCellSpacing w:w="15" w:type="dxa"/>
+        </w:trPr>
+        <w:tc>
+          <w:tcPr>
+            <w:tcW w:w="0" w:type="auto"/>
+            <w:vAlign w:val="center"/>
+            <w:hideMark/>
+          </w:tcPr>
+          <w:p>
+            <w:pPr>
+              <w:rPr>
+                <w:b/>
+                <w:bCs/>
+              </w:rPr>
+            </w:pPr>
+            <w:r>
+              <w:rPr>
+                <w:b/>
+                <w:bCs/>
+              </w:rPr>
+              <w:t xml:space="preserve">GET /api/notifications, POST /api/notifications/{id}/read</w:t>
+            </w:r>
+          </w:p>
+        </w:tc>
+        <w:tc>
+          <w:tcPr>
+            <w:tcW w:w="0" w:type="auto"/>
+            <w:vAlign w:val="center"/>
+            <w:hideMark/>
+          </w:tcPr>
+          <w:p>
+            <w:pPr>
+              <w:rPr>
+                <w:b/>
+                <w:bCs/>
+              </w:rPr>
+            </w:pPr>
+            <w:r>
+              <w:rPr>
+                <w:b/>
+                <w:bCs/>
+              </w:rPr>
+              <w:t xml:space="preserve">Owner</w:t>
             </w:r>
           </w:p>
         </w:tc>
@@ -3500,6 +3598,104 @@
           <w:bCs/>
         </w:rPr>
         <w:t xml:space="preserve">Все эндпоинты, требующие роль, работают только с данными компании вызывающего (company_id из JWT): пользователи и инструменты другой компании недоступны (404), журнал показывает только записи завхозов своей компании.</w:t>
+      </w:r>
+    </w:p>
+    <w:p>
+      <w:pPr>
+        <w:rPr>
+          <w:b/>
+          <w:bCs/>
+        </w:rPr>
+      </w:pPr>
+      <w:r>
+        <w:rPr>
+          <w:b/>
+          <w:bCs/>
+        </w:rPr>
+        <w:t xml:space="preserve">События, журнал аудита и уведомления</w:t>
+      </w:r>
+    </w:p>
+    <w:p>
+      <w:pPr>
+        <w:rPr>
+          <w:b/>
+          <w:bCs/>
+        </w:rPr>
+      </w:pPr>
+      <w:r>
+        <w:rPr>
+          <w:b/>
+          <w:bCs/>
+        </w:rPr>
+        <w:t xml:space="preserve">После значимого действия (регистрация, вход, подтверждение и увольнение пользователя, изменения реестра инструментов, синхронизация журнала) backend записывает событие «кто, что и когда сделал» в таблицу outbox_events в той же транзакции, что и само изменение, и фоновой службой отправляет его в RabbitMQ (exchange accountthis.events). HTTP-ответ брокера не ждёт: если брокер недоступен, события копятся в outbox и уходят, когда он вернётся.</w:t>
+      </w:r>
+    </w:p>
+    <w:p>
+      <w:pPr>
+        <w:rPr>
+          <w:b/>
+          <w:bCs/>
+        </w:rPr>
+      </w:pPr>
+      <w:r>
+        <w:rPr>
+          <w:b/>
+          <w:bCs/>
+        </w:rPr>
+        <w:t xml:space="preserve">События обрабатывает отдельный процесс AccountThis.Worker (с API у него общие только БД и брокер):</w:t>
+      </w:r>
+    </w:p>
+    <w:p>
+      <w:pPr>
+        <w:numPr>
+          <w:ilvl w:val="0"/>
+          <w:numId w:val="6"/>
+        </w:numPr>
+        <w:rPr>
+          <w:b/>
+          <w:bCs/>
+        </w:rPr>
+      </w:pPr>
+      <w:r>
+        <w:rPr>
+          <w:b/>
+          <w:bCs/>
+        </w:rPr>
+        <w:t xml:space="preserve">audit — все события складываются в журнал audit_events для разбора инцидентов; API этот журнал не читает;</w:t>
+      </w:r>
+    </w:p>
+    <w:p>
+      <w:pPr>
+        <w:numPr>
+          <w:ilvl w:val="0"/>
+          <w:numId w:val="6"/>
+        </w:numPr>
+        <w:rPr>
+          <w:b/>
+          <w:bCs/>
+        </w:rPr>
+      </w:pPr>
+      <w:r>
+        <w:rPr>
+          <w:b/>
+          <w:bCs/>
+        </w:rPr>
+        <w:t xml:space="preserve">notifications — уведомления Owner своей компании (GET /api/notifications, POST /api/notifications/{id}/read): сотрудник или завхоз ждёт подтверждения (уведомление само становится прочитанным, когда Owner подтвердил или уволил его); повторно предъявлен погашенный refresh token — возможна кража сессии; синхронизация сохранила записи с флагами, отличными от VALID.</w:t>
+      </w:r>
+    </w:p>
+    <w:p>
+      <w:pPr>
+        <w:rPr>
+          <w:b/>
+          <w:bCs/>
+        </w:rPr>
+      </w:pPr>
+      <w:r>
+        <w:rPr>
+          <w:b/>
+          <w:bCs/>
+        </w:rPr>
+        <w:t xml:space="preserve">Уведомление появляется не в ответе на действие, а спустя мгновение после него. Событие создаётся только при реальном изменении состояния (повторное подтверждение, увольнение, списание или повторная отправка тех же записей синхронизации событий не создают); телефоны, пароли и токены в события не попадают. Контракт событий — docs/events.md.</w:t>
       </w:r>
     </w:p>
     <w:p>

</xml_diff>